<commit_message>
Actualización y refinado de detalles
</commit_message>
<xml_diff>
--- a/Documentacion/acif104_s12_grupo5.docx
+++ b/Documentacion/acif104_s12_grupo5.docx
@@ -90,17 +90,7 @@
           <w:sz w:val="52"/>
           <w:szCs w:val="52"/>
         </w:rPr>
-        <w:t xml:space="preserve">INFORME FASE 3 — SUMATIVA </w:t>
-      </w:r>
-      <w:r>
-        <w:rPr>
-          <w:b/>
-          <w:bCs/>
-          <w:color w:val="1A1A1A"/>
-          <w:sz w:val="52"/>
-          <w:szCs w:val="52"/>
-        </w:rPr>
-        <w:t>3</w:t>
+        <w:t xml:space="preserve">INFORME FASE 3 — SUMATIVA 3</w:t>
       </w:r>
     </w:p>
     <w:p>
@@ -197,11 +187,7 @@
           </w:pPr>
           <w:r>
             <w:fldChar w:fldCharType="begin"/>
-          </w:r>
-          <w:r>
             <w:instrText>TOC \h \o "1-3"</w:instrText>
-          </w:r>
-          <w:r>
             <w:fldChar w:fldCharType="separate"/>
           </w:r>
           <w:hyperlink w:anchor="_Toc239405769" w:history="1">
@@ -217,40 +203,10 @@
                 <w:noProof/>
               </w:rPr>
               <w:tab/>
-            </w:r>
-            <w:r>
-              <w:rPr>
-                <w:noProof/>
-              </w:rPr>
               <w:fldChar w:fldCharType="begin"/>
-            </w:r>
-            <w:r>
-              <w:rPr>
-                <w:noProof/>
-              </w:rPr>
               <w:instrText xml:space="preserve"> PAGEREF _Toc239405769 \h </w:instrText>
-            </w:r>
-            <w:r>
-              <w:rPr>
-                <w:noProof/>
-              </w:rPr>
-            </w:r>
-            <w:r>
-              <w:rPr>
-                <w:noProof/>
-              </w:rPr>
               <w:fldChar w:fldCharType="separate"/>
-            </w:r>
-            <w:r>
-              <w:rPr>
-                <w:noProof/>
-              </w:rPr>
               <w:t>4</w:t>
-            </w:r>
-            <w:r>
-              <w:rPr>
-                <w:noProof/>
-              </w:rPr>
               <w:fldChar w:fldCharType="end"/>
             </w:r>
           </w:hyperlink>
@@ -278,40 +234,10 @@
                 <w:noProof/>
               </w:rPr>
               <w:tab/>
-            </w:r>
-            <w:r>
-              <w:rPr>
-                <w:noProof/>
-              </w:rPr>
               <w:fldChar w:fldCharType="begin"/>
-            </w:r>
-            <w:r>
-              <w:rPr>
-                <w:noProof/>
-              </w:rPr>
               <w:instrText xml:space="preserve"> PAGEREF _Toc239405770 \h </w:instrText>
-            </w:r>
-            <w:r>
-              <w:rPr>
-                <w:noProof/>
-              </w:rPr>
-            </w:r>
-            <w:r>
-              <w:rPr>
-                <w:noProof/>
-              </w:rPr>
               <w:fldChar w:fldCharType="separate"/>
-            </w:r>
-            <w:r>
-              <w:rPr>
-                <w:noProof/>
-              </w:rPr>
               <w:t>4</w:t>
-            </w:r>
-            <w:r>
-              <w:rPr>
-                <w:noProof/>
-              </w:rPr>
               <w:fldChar w:fldCharType="end"/>
             </w:r>
           </w:hyperlink>
@@ -339,40 +265,10 @@
                 <w:noProof/>
               </w:rPr>
               <w:tab/>
-            </w:r>
-            <w:r>
-              <w:rPr>
-                <w:noProof/>
-              </w:rPr>
               <w:fldChar w:fldCharType="begin"/>
-            </w:r>
-            <w:r>
-              <w:rPr>
-                <w:noProof/>
-              </w:rPr>
               <w:instrText xml:space="preserve"> PAGEREF _Toc239405771 \h </w:instrText>
-            </w:r>
-            <w:r>
-              <w:rPr>
-                <w:noProof/>
-              </w:rPr>
-            </w:r>
-            <w:r>
-              <w:rPr>
-                <w:noProof/>
-              </w:rPr>
               <w:fldChar w:fldCharType="separate"/>
-            </w:r>
-            <w:r>
-              <w:rPr>
-                <w:noProof/>
-              </w:rPr>
               <w:t>5</w:t>
-            </w:r>
-            <w:r>
-              <w:rPr>
-                <w:noProof/>
-              </w:rPr>
               <w:fldChar w:fldCharType="end"/>
             </w:r>
           </w:hyperlink>
@@ -400,40 +296,10 @@
                 <w:noProof/>
               </w:rPr>
               <w:tab/>
-            </w:r>
-            <w:r>
-              <w:rPr>
-                <w:noProof/>
-              </w:rPr>
               <w:fldChar w:fldCharType="begin"/>
-            </w:r>
-            <w:r>
-              <w:rPr>
-                <w:noProof/>
-              </w:rPr>
               <w:instrText xml:space="preserve"> PAGEREF _Toc239405772 \h </w:instrText>
-            </w:r>
-            <w:r>
-              <w:rPr>
-                <w:noProof/>
-              </w:rPr>
-            </w:r>
-            <w:r>
-              <w:rPr>
-                <w:noProof/>
-              </w:rPr>
               <w:fldChar w:fldCharType="separate"/>
-            </w:r>
-            <w:r>
-              <w:rPr>
-                <w:noProof/>
-              </w:rPr>
               <w:t>6</w:t>
-            </w:r>
-            <w:r>
-              <w:rPr>
-                <w:noProof/>
-              </w:rPr>
               <w:fldChar w:fldCharType="end"/>
             </w:r>
           </w:hyperlink>
@@ -461,40 +327,10 @@
                 <w:noProof/>
               </w:rPr>
               <w:tab/>
-            </w:r>
-            <w:r>
-              <w:rPr>
-                <w:noProof/>
-              </w:rPr>
               <w:fldChar w:fldCharType="begin"/>
-            </w:r>
-            <w:r>
-              <w:rPr>
-                <w:noProof/>
-              </w:rPr>
               <w:instrText xml:space="preserve"> PAGEREF _Toc239405773 \h </w:instrText>
-            </w:r>
-            <w:r>
-              <w:rPr>
-                <w:noProof/>
-              </w:rPr>
-            </w:r>
-            <w:r>
-              <w:rPr>
-                <w:noProof/>
-              </w:rPr>
               <w:fldChar w:fldCharType="separate"/>
-            </w:r>
-            <w:r>
-              <w:rPr>
-                <w:noProof/>
-              </w:rPr>
               <w:t>6</w:t>
-            </w:r>
-            <w:r>
-              <w:rPr>
-                <w:noProof/>
-              </w:rPr>
               <w:fldChar w:fldCharType="end"/>
             </w:r>
           </w:hyperlink>
@@ -522,40 +358,10 @@
                 <w:noProof/>
               </w:rPr>
               <w:tab/>
-            </w:r>
-            <w:r>
-              <w:rPr>
-                <w:noProof/>
-              </w:rPr>
               <w:fldChar w:fldCharType="begin"/>
-            </w:r>
-            <w:r>
-              <w:rPr>
-                <w:noProof/>
-              </w:rPr>
               <w:instrText xml:space="preserve"> PAGEREF _Toc239405774 \h </w:instrText>
-            </w:r>
-            <w:r>
-              <w:rPr>
-                <w:noProof/>
-              </w:rPr>
-            </w:r>
-            <w:r>
-              <w:rPr>
-                <w:noProof/>
-              </w:rPr>
               <w:fldChar w:fldCharType="separate"/>
-            </w:r>
-            <w:r>
-              <w:rPr>
-                <w:noProof/>
-              </w:rPr>
               <w:t>6</w:t>
-            </w:r>
-            <w:r>
-              <w:rPr>
-                <w:noProof/>
-              </w:rPr>
               <w:fldChar w:fldCharType="end"/>
             </w:r>
           </w:hyperlink>
@@ -583,40 +389,10 @@
                 <w:noProof/>
               </w:rPr>
               <w:tab/>
-            </w:r>
-            <w:r>
-              <w:rPr>
-                <w:noProof/>
-              </w:rPr>
               <w:fldChar w:fldCharType="begin"/>
-            </w:r>
-            <w:r>
-              <w:rPr>
-                <w:noProof/>
-              </w:rPr>
               <w:instrText xml:space="preserve"> PAGEREF _Toc239405775 \h </w:instrText>
-            </w:r>
-            <w:r>
-              <w:rPr>
-                <w:noProof/>
-              </w:rPr>
-            </w:r>
-            <w:r>
-              <w:rPr>
-                <w:noProof/>
-              </w:rPr>
               <w:fldChar w:fldCharType="separate"/>
-            </w:r>
-            <w:r>
-              <w:rPr>
-                <w:noProof/>
-              </w:rPr>
               <w:t>7</w:t>
-            </w:r>
-            <w:r>
-              <w:rPr>
-                <w:noProof/>
-              </w:rPr>
               <w:fldChar w:fldCharType="end"/>
             </w:r>
           </w:hyperlink>
@@ -644,40 +420,10 @@
                 <w:noProof/>
               </w:rPr>
               <w:tab/>
-            </w:r>
-            <w:r>
-              <w:rPr>
-                <w:noProof/>
-              </w:rPr>
               <w:fldChar w:fldCharType="begin"/>
-            </w:r>
-            <w:r>
-              <w:rPr>
-                <w:noProof/>
-              </w:rPr>
               <w:instrText xml:space="preserve"> PAGEREF _Toc239405776 \h </w:instrText>
-            </w:r>
-            <w:r>
-              <w:rPr>
-                <w:noProof/>
-              </w:rPr>
-            </w:r>
-            <w:r>
-              <w:rPr>
-                <w:noProof/>
-              </w:rPr>
               <w:fldChar w:fldCharType="separate"/>
-            </w:r>
-            <w:r>
-              <w:rPr>
-                <w:noProof/>
-              </w:rPr>
               <w:t>8</w:t>
-            </w:r>
-            <w:r>
-              <w:rPr>
-                <w:noProof/>
-              </w:rPr>
               <w:fldChar w:fldCharType="end"/>
             </w:r>
           </w:hyperlink>
@@ -705,40 +451,10 @@
                 <w:noProof/>
               </w:rPr>
               <w:tab/>
-            </w:r>
-            <w:r>
-              <w:rPr>
-                <w:noProof/>
-              </w:rPr>
               <w:fldChar w:fldCharType="begin"/>
-            </w:r>
-            <w:r>
-              <w:rPr>
-                <w:noProof/>
-              </w:rPr>
               <w:instrText xml:space="preserve"> PAGEREF _Toc239405777 \h </w:instrText>
-            </w:r>
-            <w:r>
-              <w:rPr>
-                <w:noProof/>
-              </w:rPr>
-            </w:r>
-            <w:r>
-              <w:rPr>
-                <w:noProof/>
-              </w:rPr>
               <w:fldChar w:fldCharType="separate"/>
-            </w:r>
-            <w:r>
-              <w:rPr>
-                <w:noProof/>
-              </w:rPr>
               <w:t>9</w:t>
-            </w:r>
-            <w:r>
-              <w:rPr>
-                <w:noProof/>
-              </w:rPr>
               <w:fldChar w:fldCharType="end"/>
             </w:r>
           </w:hyperlink>
@@ -766,40 +482,10 @@
                 <w:noProof/>
               </w:rPr>
               <w:tab/>
-            </w:r>
-            <w:r>
-              <w:rPr>
-                <w:noProof/>
-              </w:rPr>
               <w:fldChar w:fldCharType="begin"/>
-            </w:r>
-            <w:r>
-              <w:rPr>
-                <w:noProof/>
-              </w:rPr>
               <w:instrText xml:space="preserve"> PAGEREF _Toc239405778 \h </w:instrText>
-            </w:r>
-            <w:r>
-              <w:rPr>
-                <w:noProof/>
-              </w:rPr>
-            </w:r>
-            <w:r>
-              <w:rPr>
-                <w:noProof/>
-              </w:rPr>
               <w:fldChar w:fldCharType="separate"/>
-            </w:r>
-            <w:r>
-              <w:rPr>
-                <w:noProof/>
-              </w:rPr>
               <w:t>9</w:t>
-            </w:r>
-            <w:r>
-              <w:rPr>
-                <w:noProof/>
-              </w:rPr>
               <w:fldChar w:fldCharType="end"/>
             </w:r>
           </w:hyperlink>
@@ -827,40 +513,10 @@
                 <w:noProof/>
               </w:rPr>
               <w:tab/>
-            </w:r>
-            <w:r>
-              <w:rPr>
-                <w:noProof/>
-              </w:rPr>
               <w:fldChar w:fldCharType="begin"/>
-            </w:r>
-            <w:r>
-              <w:rPr>
-                <w:noProof/>
-              </w:rPr>
               <w:instrText xml:space="preserve"> PAGEREF _Toc239405779 \h </w:instrText>
-            </w:r>
-            <w:r>
-              <w:rPr>
-                <w:noProof/>
-              </w:rPr>
-            </w:r>
-            <w:r>
-              <w:rPr>
-                <w:noProof/>
-              </w:rPr>
               <w:fldChar w:fldCharType="separate"/>
-            </w:r>
-            <w:r>
-              <w:rPr>
-                <w:noProof/>
-              </w:rPr>
               <w:t>9</w:t>
-            </w:r>
-            <w:r>
-              <w:rPr>
-                <w:noProof/>
-              </w:rPr>
               <w:fldChar w:fldCharType="end"/>
             </w:r>
           </w:hyperlink>
@@ -888,40 +544,10 @@
                 <w:noProof/>
               </w:rPr>
               <w:tab/>
-            </w:r>
-            <w:r>
-              <w:rPr>
-                <w:noProof/>
-              </w:rPr>
               <w:fldChar w:fldCharType="begin"/>
-            </w:r>
-            <w:r>
-              <w:rPr>
-                <w:noProof/>
-              </w:rPr>
               <w:instrText xml:space="preserve"> PAGEREF _Toc239405780 \h </w:instrText>
-            </w:r>
-            <w:r>
-              <w:rPr>
-                <w:noProof/>
-              </w:rPr>
-            </w:r>
-            <w:r>
-              <w:rPr>
-                <w:noProof/>
-              </w:rPr>
               <w:fldChar w:fldCharType="separate"/>
-            </w:r>
-            <w:r>
-              <w:rPr>
-                <w:noProof/>
-              </w:rPr>
               <w:t>9</w:t>
-            </w:r>
-            <w:r>
-              <w:rPr>
-                <w:noProof/>
-              </w:rPr>
               <w:fldChar w:fldCharType="end"/>
             </w:r>
           </w:hyperlink>
@@ -949,40 +575,10 @@
                 <w:noProof/>
               </w:rPr>
               <w:tab/>
-            </w:r>
-            <w:r>
-              <w:rPr>
-                <w:noProof/>
-              </w:rPr>
               <w:fldChar w:fldCharType="begin"/>
-            </w:r>
-            <w:r>
-              <w:rPr>
-                <w:noProof/>
-              </w:rPr>
               <w:instrText xml:space="preserve"> PAGEREF _Toc239405781 \h </w:instrText>
-            </w:r>
-            <w:r>
-              <w:rPr>
-                <w:noProof/>
-              </w:rPr>
-            </w:r>
-            <w:r>
-              <w:rPr>
-                <w:noProof/>
-              </w:rPr>
               <w:fldChar w:fldCharType="separate"/>
-            </w:r>
-            <w:r>
-              <w:rPr>
-                <w:noProof/>
-              </w:rPr>
               <w:t>9</w:t>
-            </w:r>
-            <w:r>
-              <w:rPr>
-                <w:noProof/>
-              </w:rPr>
               <w:fldChar w:fldCharType="end"/>
             </w:r>
           </w:hyperlink>
@@ -1010,40 +606,10 @@
                 <w:noProof/>
               </w:rPr>
               <w:tab/>
-            </w:r>
-            <w:r>
-              <w:rPr>
-                <w:noProof/>
-              </w:rPr>
               <w:fldChar w:fldCharType="begin"/>
-            </w:r>
-            <w:r>
-              <w:rPr>
-                <w:noProof/>
-              </w:rPr>
               <w:instrText xml:space="preserve"> PAGEREF _Toc239405782 \h </w:instrText>
-            </w:r>
-            <w:r>
-              <w:rPr>
-                <w:noProof/>
-              </w:rPr>
-            </w:r>
-            <w:r>
-              <w:rPr>
-                <w:noProof/>
-              </w:rPr>
               <w:fldChar w:fldCharType="separate"/>
-            </w:r>
-            <w:r>
-              <w:rPr>
-                <w:noProof/>
-              </w:rPr>
               <w:t>10</w:t>
-            </w:r>
-            <w:r>
-              <w:rPr>
-                <w:noProof/>
-              </w:rPr>
               <w:fldChar w:fldCharType="end"/>
             </w:r>
           </w:hyperlink>
@@ -1071,40 +637,10 @@
                 <w:noProof/>
               </w:rPr>
               <w:tab/>
-            </w:r>
-            <w:r>
-              <w:rPr>
-                <w:noProof/>
-              </w:rPr>
               <w:fldChar w:fldCharType="begin"/>
-            </w:r>
-            <w:r>
-              <w:rPr>
-                <w:noProof/>
-              </w:rPr>
               <w:instrText xml:space="preserve"> PAGEREF _Toc239405783 \h </w:instrText>
-            </w:r>
-            <w:r>
-              <w:rPr>
-                <w:noProof/>
-              </w:rPr>
-            </w:r>
-            <w:r>
-              <w:rPr>
-                <w:noProof/>
-              </w:rPr>
               <w:fldChar w:fldCharType="separate"/>
-            </w:r>
-            <w:r>
-              <w:rPr>
-                <w:noProof/>
-              </w:rPr>
               <w:t>11</w:t>
-            </w:r>
-            <w:r>
-              <w:rPr>
-                <w:noProof/>
-              </w:rPr>
               <w:fldChar w:fldCharType="end"/>
             </w:r>
           </w:hyperlink>
@@ -1132,40 +668,10 @@
                 <w:noProof/>
               </w:rPr>
               <w:tab/>
-            </w:r>
-            <w:r>
-              <w:rPr>
-                <w:noProof/>
-              </w:rPr>
               <w:fldChar w:fldCharType="begin"/>
-            </w:r>
-            <w:r>
-              <w:rPr>
-                <w:noProof/>
-              </w:rPr>
               <w:instrText xml:space="preserve"> PAGEREF _Toc239405784 \h </w:instrText>
-            </w:r>
-            <w:r>
-              <w:rPr>
-                <w:noProof/>
-              </w:rPr>
-            </w:r>
-            <w:r>
-              <w:rPr>
-                <w:noProof/>
-              </w:rPr>
               <w:fldChar w:fldCharType="separate"/>
-            </w:r>
-            <w:r>
-              <w:rPr>
-                <w:noProof/>
-              </w:rPr>
               <w:t>12</w:t>
-            </w:r>
-            <w:r>
-              <w:rPr>
-                <w:noProof/>
-              </w:rPr>
               <w:fldChar w:fldCharType="end"/>
             </w:r>
           </w:hyperlink>
@@ -1193,40 +699,10 @@
                 <w:noProof/>
               </w:rPr>
               <w:tab/>
-            </w:r>
-            <w:r>
-              <w:rPr>
-                <w:noProof/>
-              </w:rPr>
               <w:fldChar w:fldCharType="begin"/>
-            </w:r>
-            <w:r>
-              <w:rPr>
-                <w:noProof/>
-              </w:rPr>
               <w:instrText xml:space="preserve"> PAGEREF _Toc239405785 \h </w:instrText>
-            </w:r>
-            <w:r>
-              <w:rPr>
-                <w:noProof/>
-              </w:rPr>
-            </w:r>
-            <w:r>
-              <w:rPr>
-                <w:noProof/>
-              </w:rPr>
               <w:fldChar w:fldCharType="separate"/>
-            </w:r>
-            <w:r>
-              <w:rPr>
-                <w:noProof/>
-              </w:rPr>
               <w:t>13</w:t>
-            </w:r>
-            <w:r>
-              <w:rPr>
-                <w:noProof/>
-              </w:rPr>
               <w:fldChar w:fldCharType="end"/>
             </w:r>
           </w:hyperlink>
@@ -1254,40 +730,10 @@
                 <w:noProof/>
               </w:rPr>
               <w:tab/>
-            </w:r>
-            <w:r>
-              <w:rPr>
-                <w:noProof/>
-              </w:rPr>
               <w:fldChar w:fldCharType="begin"/>
-            </w:r>
-            <w:r>
-              <w:rPr>
-                <w:noProof/>
-              </w:rPr>
               <w:instrText xml:space="preserve"> PAGEREF _Toc239405786 \h </w:instrText>
-            </w:r>
-            <w:r>
-              <w:rPr>
-                <w:noProof/>
-              </w:rPr>
-            </w:r>
-            <w:r>
-              <w:rPr>
-                <w:noProof/>
-              </w:rPr>
               <w:fldChar w:fldCharType="separate"/>
-            </w:r>
-            <w:r>
-              <w:rPr>
-                <w:noProof/>
-              </w:rPr>
               <w:t>13</w:t>
-            </w:r>
-            <w:r>
-              <w:rPr>
-                <w:noProof/>
-              </w:rPr>
               <w:fldChar w:fldCharType="end"/>
             </w:r>
           </w:hyperlink>
@@ -1315,40 +761,10 @@
                 <w:noProof/>
               </w:rPr>
               <w:tab/>
-            </w:r>
-            <w:r>
-              <w:rPr>
-                <w:noProof/>
-              </w:rPr>
               <w:fldChar w:fldCharType="begin"/>
-            </w:r>
-            <w:r>
-              <w:rPr>
-                <w:noProof/>
-              </w:rPr>
               <w:instrText xml:space="preserve"> PAGEREF _Toc239405787 \h </w:instrText>
-            </w:r>
-            <w:r>
-              <w:rPr>
-                <w:noProof/>
-              </w:rPr>
-            </w:r>
-            <w:r>
-              <w:rPr>
-                <w:noProof/>
-              </w:rPr>
               <w:fldChar w:fldCharType="separate"/>
-            </w:r>
-            <w:r>
-              <w:rPr>
-                <w:noProof/>
-              </w:rPr>
               <w:t>15</w:t>
-            </w:r>
-            <w:r>
-              <w:rPr>
-                <w:noProof/>
-              </w:rPr>
               <w:fldChar w:fldCharType="end"/>
             </w:r>
           </w:hyperlink>
@@ -1376,40 +792,10 @@
                 <w:noProof/>
               </w:rPr>
               <w:tab/>
-            </w:r>
-            <w:r>
-              <w:rPr>
-                <w:noProof/>
-              </w:rPr>
               <w:fldChar w:fldCharType="begin"/>
-            </w:r>
-            <w:r>
-              <w:rPr>
-                <w:noProof/>
-              </w:rPr>
               <w:instrText xml:space="preserve"> PAGEREF _Toc239405788 \h </w:instrText>
-            </w:r>
-            <w:r>
-              <w:rPr>
-                <w:noProof/>
-              </w:rPr>
-            </w:r>
-            <w:r>
-              <w:rPr>
-                <w:noProof/>
-              </w:rPr>
               <w:fldChar w:fldCharType="separate"/>
-            </w:r>
-            <w:r>
-              <w:rPr>
-                <w:noProof/>
-              </w:rPr>
               <w:t>15</w:t>
-            </w:r>
-            <w:r>
-              <w:rPr>
-                <w:noProof/>
-              </w:rPr>
               <w:fldChar w:fldCharType="end"/>
             </w:r>
           </w:hyperlink>
@@ -1437,40 +823,10 @@
                 <w:noProof/>
               </w:rPr>
               <w:tab/>
-            </w:r>
-            <w:r>
-              <w:rPr>
-                <w:noProof/>
-              </w:rPr>
               <w:fldChar w:fldCharType="begin"/>
-            </w:r>
-            <w:r>
-              <w:rPr>
-                <w:noProof/>
-              </w:rPr>
               <w:instrText xml:space="preserve"> PAGEREF _Toc239405789 \h </w:instrText>
-            </w:r>
-            <w:r>
-              <w:rPr>
-                <w:noProof/>
-              </w:rPr>
-            </w:r>
-            <w:r>
-              <w:rPr>
-                <w:noProof/>
-              </w:rPr>
               <w:fldChar w:fldCharType="separate"/>
-            </w:r>
-            <w:r>
-              <w:rPr>
-                <w:noProof/>
-              </w:rPr>
               <w:t>15</w:t>
-            </w:r>
-            <w:r>
-              <w:rPr>
-                <w:noProof/>
-              </w:rPr>
               <w:fldChar w:fldCharType="end"/>
             </w:r>
           </w:hyperlink>
@@ -1498,40 +854,10 @@
                 <w:noProof/>
               </w:rPr>
               <w:tab/>
-            </w:r>
-            <w:r>
-              <w:rPr>
-                <w:noProof/>
-              </w:rPr>
               <w:fldChar w:fldCharType="begin"/>
-            </w:r>
-            <w:r>
-              <w:rPr>
-                <w:noProof/>
-              </w:rPr>
               <w:instrText xml:space="preserve"> PAGEREF _Toc239405790 \h </w:instrText>
-            </w:r>
-            <w:r>
-              <w:rPr>
-                <w:noProof/>
-              </w:rPr>
-            </w:r>
-            <w:r>
-              <w:rPr>
-                <w:noProof/>
-              </w:rPr>
               <w:fldChar w:fldCharType="separate"/>
-            </w:r>
-            <w:r>
-              <w:rPr>
-                <w:noProof/>
-              </w:rPr>
               <w:t>16</w:t>
-            </w:r>
-            <w:r>
-              <w:rPr>
-                <w:noProof/>
-              </w:rPr>
               <w:fldChar w:fldCharType="end"/>
             </w:r>
           </w:hyperlink>
@@ -1559,40 +885,10 @@
                 <w:noProof/>
               </w:rPr>
               <w:tab/>
-            </w:r>
-            <w:r>
-              <w:rPr>
-                <w:noProof/>
-              </w:rPr>
               <w:fldChar w:fldCharType="begin"/>
-            </w:r>
-            <w:r>
-              <w:rPr>
-                <w:noProof/>
-              </w:rPr>
               <w:instrText xml:space="preserve"> PAGEREF _Toc239405791 \h </w:instrText>
-            </w:r>
-            <w:r>
-              <w:rPr>
-                <w:noProof/>
-              </w:rPr>
-            </w:r>
-            <w:r>
-              <w:rPr>
-                <w:noProof/>
-              </w:rPr>
               <w:fldChar w:fldCharType="separate"/>
-            </w:r>
-            <w:r>
-              <w:rPr>
-                <w:noProof/>
-              </w:rPr>
               <w:t>16</w:t>
-            </w:r>
-            <w:r>
-              <w:rPr>
-                <w:noProof/>
-              </w:rPr>
               <w:fldChar w:fldCharType="end"/>
             </w:r>
           </w:hyperlink>
@@ -1620,40 +916,10 @@
                 <w:noProof/>
               </w:rPr>
               <w:tab/>
-            </w:r>
-            <w:r>
-              <w:rPr>
-                <w:noProof/>
-              </w:rPr>
               <w:fldChar w:fldCharType="begin"/>
-            </w:r>
-            <w:r>
-              <w:rPr>
-                <w:noProof/>
-              </w:rPr>
               <w:instrText xml:space="preserve"> PAGEREF _Toc239405792 \h </w:instrText>
-            </w:r>
-            <w:r>
-              <w:rPr>
-                <w:noProof/>
-              </w:rPr>
-            </w:r>
-            <w:r>
-              <w:rPr>
-                <w:noProof/>
-              </w:rPr>
               <w:fldChar w:fldCharType="separate"/>
-            </w:r>
-            <w:r>
-              <w:rPr>
-                <w:noProof/>
-              </w:rPr>
               <w:t>17</w:t>
-            </w:r>
-            <w:r>
-              <w:rPr>
-                <w:noProof/>
-              </w:rPr>
               <w:fldChar w:fldCharType="end"/>
             </w:r>
           </w:hyperlink>
@@ -1681,40 +947,10 @@
                 <w:noProof/>
               </w:rPr>
               <w:tab/>
-            </w:r>
-            <w:r>
-              <w:rPr>
-                <w:noProof/>
-              </w:rPr>
               <w:fldChar w:fldCharType="begin"/>
-            </w:r>
-            <w:r>
-              <w:rPr>
-                <w:noProof/>
-              </w:rPr>
               <w:instrText xml:space="preserve"> PAGEREF _Toc239405793 \h </w:instrText>
-            </w:r>
-            <w:r>
-              <w:rPr>
-                <w:noProof/>
-              </w:rPr>
-            </w:r>
-            <w:r>
-              <w:rPr>
-                <w:noProof/>
-              </w:rPr>
               <w:fldChar w:fldCharType="separate"/>
-            </w:r>
-            <w:r>
-              <w:rPr>
-                <w:noProof/>
-              </w:rPr>
               <w:t>17</w:t>
-            </w:r>
-            <w:r>
-              <w:rPr>
-                <w:noProof/>
-              </w:rPr>
               <w:fldChar w:fldCharType="end"/>
             </w:r>
           </w:hyperlink>
@@ -1742,40 +978,10 @@
                 <w:noProof/>
               </w:rPr>
               <w:tab/>
-            </w:r>
-            <w:r>
-              <w:rPr>
-                <w:noProof/>
-              </w:rPr>
               <w:fldChar w:fldCharType="begin"/>
-            </w:r>
-            <w:r>
-              <w:rPr>
-                <w:noProof/>
-              </w:rPr>
               <w:instrText xml:space="preserve"> PAGEREF _Toc239405794 \h </w:instrText>
-            </w:r>
-            <w:r>
-              <w:rPr>
-                <w:noProof/>
-              </w:rPr>
-            </w:r>
-            <w:r>
-              <w:rPr>
-                <w:noProof/>
-              </w:rPr>
               <w:fldChar w:fldCharType="separate"/>
-            </w:r>
-            <w:r>
-              <w:rPr>
-                <w:noProof/>
-              </w:rPr>
               <w:t>18</w:t>
-            </w:r>
-            <w:r>
-              <w:rPr>
-                <w:noProof/>
-              </w:rPr>
               <w:fldChar w:fldCharType="end"/>
             </w:r>
           </w:hyperlink>
@@ -1803,40 +1009,10 @@
                 <w:noProof/>
               </w:rPr>
               <w:tab/>
-            </w:r>
-            <w:r>
-              <w:rPr>
-                <w:noProof/>
-              </w:rPr>
               <w:fldChar w:fldCharType="begin"/>
-            </w:r>
-            <w:r>
-              <w:rPr>
-                <w:noProof/>
-              </w:rPr>
               <w:instrText xml:space="preserve"> PAGEREF _Toc239405795 \h </w:instrText>
-            </w:r>
-            <w:r>
-              <w:rPr>
-                <w:noProof/>
-              </w:rPr>
-            </w:r>
-            <w:r>
-              <w:rPr>
-                <w:noProof/>
-              </w:rPr>
               <w:fldChar w:fldCharType="separate"/>
-            </w:r>
-            <w:r>
-              <w:rPr>
-                <w:noProof/>
-              </w:rPr>
               <w:t>19</w:t>
-            </w:r>
-            <w:r>
-              <w:rPr>
-                <w:noProof/>
-              </w:rPr>
               <w:fldChar w:fldCharType="end"/>
             </w:r>
           </w:hyperlink>
@@ -1864,40 +1040,10 @@
                 <w:noProof/>
               </w:rPr>
               <w:tab/>
-            </w:r>
-            <w:r>
-              <w:rPr>
-                <w:noProof/>
-              </w:rPr>
               <w:fldChar w:fldCharType="begin"/>
-            </w:r>
-            <w:r>
-              <w:rPr>
-                <w:noProof/>
-              </w:rPr>
               <w:instrText xml:space="preserve"> PAGEREF _Toc239405796 \h </w:instrText>
-            </w:r>
-            <w:r>
-              <w:rPr>
-                <w:noProof/>
-              </w:rPr>
-            </w:r>
-            <w:r>
-              <w:rPr>
-                <w:noProof/>
-              </w:rPr>
               <w:fldChar w:fldCharType="separate"/>
-            </w:r>
-            <w:r>
-              <w:rPr>
-                <w:noProof/>
-              </w:rPr>
               <w:t>21</w:t>
-            </w:r>
-            <w:r>
-              <w:rPr>
-                <w:noProof/>
-              </w:rPr>
               <w:fldChar w:fldCharType="end"/>
             </w:r>
           </w:hyperlink>
@@ -1925,40 +1071,10 @@
                 <w:noProof/>
               </w:rPr>
               <w:tab/>
-            </w:r>
-            <w:r>
-              <w:rPr>
-                <w:noProof/>
-              </w:rPr>
               <w:fldChar w:fldCharType="begin"/>
-            </w:r>
-            <w:r>
-              <w:rPr>
-                <w:noProof/>
-              </w:rPr>
               <w:instrText xml:space="preserve"> PAGEREF _Toc239405797 \h </w:instrText>
-            </w:r>
-            <w:r>
-              <w:rPr>
-                <w:noProof/>
-              </w:rPr>
-            </w:r>
-            <w:r>
-              <w:rPr>
-                <w:noProof/>
-              </w:rPr>
               <w:fldChar w:fldCharType="separate"/>
-            </w:r>
-            <w:r>
-              <w:rPr>
-                <w:noProof/>
-              </w:rPr>
               <w:t>21</w:t>
-            </w:r>
-            <w:r>
-              <w:rPr>
-                <w:noProof/>
-              </w:rPr>
               <w:fldChar w:fldCharType="end"/>
             </w:r>
           </w:hyperlink>
@@ -1986,40 +1102,10 @@
                 <w:noProof/>
               </w:rPr>
               <w:tab/>
-            </w:r>
-            <w:r>
-              <w:rPr>
-                <w:noProof/>
-              </w:rPr>
               <w:fldChar w:fldCharType="begin"/>
-            </w:r>
-            <w:r>
-              <w:rPr>
-                <w:noProof/>
-              </w:rPr>
               <w:instrText xml:space="preserve"> PAGEREF _Toc239405798 \h </w:instrText>
-            </w:r>
-            <w:r>
-              <w:rPr>
-                <w:noProof/>
-              </w:rPr>
-            </w:r>
-            <w:r>
-              <w:rPr>
-                <w:noProof/>
-              </w:rPr>
               <w:fldChar w:fldCharType="separate"/>
-            </w:r>
-            <w:r>
-              <w:rPr>
-                <w:noProof/>
-              </w:rPr>
               <w:t>21</w:t>
-            </w:r>
-            <w:r>
-              <w:rPr>
-                <w:noProof/>
-              </w:rPr>
               <w:fldChar w:fldCharType="end"/>
             </w:r>
           </w:hyperlink>
@@ -2047,40 +1133,10 @@
                 <w:noProof/>
               </w:rPr>
               <w:tab/>
-            </w:r>
-            <w:r>
-              <w:rPr>
-                <w:noProof/>
-              </w:rPr>
               <w:fldChar w:fldCharType="begin"/>
-            </w:r>
-            <w:r>
-              <w:rPr>
-                <w:noProof/>
-              </w:rPr>
               <w:instrText xml:space="preserve"> PAGEREF _Toc239405799 \h </w:instrText>
-            </w:r>
-            <w:r>
-              <w:rPr>
-                <w:noProof/>
-              </w:rPr>
-            </w:r>
-            <w:r>
-              <w:rPr>
-                <w:noProof/>
-              </w:rPr>
               <w:fldChar w:fldCharType="separate"/>
-            </w:r>
-            <w:r>
-              <w:rPr>
-                <w:noProof/>
-              </w:rPr>
               <w:t>23</w:t>
-            </w:r>
-            <w:r>
-              <w:rPr>
-                <w:noProof/>
-              </w:rPr>
               <w:fldChar w:fldCharType="end"/>
             </w:r>
           </w:hyperlink>
@@ -2108,40 +1164,10 @@
                 <w:noProof/>
               </w:rPr>
               <w:tab/>
-            </w:r>
-            <w:r>
-              <w:rPr>
-                <w:noProof/>
-              </w:rPr>
               <w:fldChar w:fldCharType="begin"/>
-            </w:r>
-            <w:r>
-              <w:rPr>
-                <w:noProof/>
-              </w:rPr>
               <w:instrText xml:space="preserve"> PAGEREF _Toc239405800 \h </w:instrText>
-            </w:r>
-            <w:r>
-              <w:rPr>
-                <w:noProof/>
-              </w:rPr>
-            </w:r>
-            <w:r>
-              <w:rPr>
-                <w:noProof/>
-              </w:rPr>
               <w:fldChar w:fldCharType="separate"/>
-            </w:r>
-            <w:r>
-              <w:rPr>
-                <w:noProof/>
-              </w:rPr>
               <w:t>26</w:t>
-            </w:r>
-            <w:r>
-              <w:rPr>
-                <w:noProof/>
-              </w:rPr>
               <w:fldChar w:fldCharType="end"/>
             </w:r>
           </w:hyperlink>
@@ -2169,40 +1195,10 @@
                 <w:noProof/>
               </w:rPr>
               <w:tab/>
-            </w:r>
-            <w:r>
-              <w:rPr>
-                <w:noProof/>
-              </w:rPr>
               <w:fldChar w:fldCharType="begin"/>
-            </w:r>
-            <w:r>
-              <w:rPr>
-                <w:noProof/>
-              </w:rPr>
               <w:instrText xml:space="preserve"> PAGEREF _Toc239405801 \h </w:instrText>
-            </w:r>
-            <w:r>
-              <w:rPr>
-                <w:noProof/>
-              </w:rPr>
-            </w:r>
-            <w:r>
-              <w:rPr>
-                <w:noProof/>
-              </w:rPr>
               <w:fldChar w:fldCharType="separate"/>
-            </w:r>
-            <w:r>
-              <w:rPr>
-                <w:noProof/>
-              </w:rPr>
               <w:t>26</w:t>
-            </w:r>
-            <w:r>
-              <w:rPr>
-                <w:noProof/>
-              </w:rPr>
               <w:fldChar w:fldCharType="end"/>
             </w:r>
           </w:hyperlink>
@@ -2230,40 +1226,10 @@
                 <w:noProof/>
               </w:rPr>
               <w:tab/>
-            </w:r>
-            <w:r>
-              <w:rPr>
-                <w:noProof/>
-              </w:rPr>
               <w:fldChar w:fldCharType="begin"/>
-            </w:r>
-            <w:r>
-              <w:rPr>
-                <w:noProof/>
-              </w:rPr>
               <w:instrText xml:space="preserve"> PAGEREF _Toc239405802 \h </w:instrText>
-            </w:r>
-            <w:r>
-              <w:rPr>
-                <w:noProof/>
-              </w:rPr>
-            </w:r>
-            <w:r>
-              <w:rPr>
-                <w:noProof/>
-              </w:rPr>
               <w:fldChar w:fldCharType="separate"/>
-            </w:r>
-            <w:r>
-              <w:rPr>
-                <w:noProof/>
-              </w:rPr>
               <w:t>26</w:t>
-            </w:r>
-            <w:r>
-              <w:rPr>
-                <w:noProof/>
-              </w:rPr>
               <w:fldChar w:fldCharType="end"/>
             </w:r>
           </w:hyperlink>
@@ -2291,40 +1257,10 @@
                 <w:noProof/>
               </w:rPr>
               <w:tab/>
-            </w:r>
-            <w:r>
-              <w:rPr>
-                <w:noProof/>
-              </w:rPr>
               <w:fldChar w:fldCharType="begin"/>
-            </w:r>
-            <w:r>
-              <w:rPr>
-                <w:noProof/>
-              </w:rPr>
               <w:instrText xml:space="preserve"> PAGEREF _Toc239405803 \h </w:instrText>
-            </w:r>
-            <w:r>
-              <w:rPr>
-                <w:noProof/>
-              </w:rPr>
-            </w:r>
-            <w:r>
-              <w:rPr>
-                <w:noProof/>
-              </w:rPr>
               <w:fldChar w:fldCharType="separate"/>
-            </w:r>
-            <w:r>
-              <w:rPr>
-                <w:noProof/>
-              </w:rPr>
               <w:t>26</w:t>
-            </w:r>
-            <w:r>
-              <w:rPr>
-                <w:noProof/>
-              </w:rPr>
               <w:fldChar w:fldCharType="end"/>
             </w:r>
           </w:hyperlink>
@@ -2352,40 +1288,10 @@
                 <w:noProof/>
               </w:rPr>
               <w:tab/>
-            </w:r>
-            <w:r>
-              <w:rPr>
-                <w:noProof/>
-              </w:rPr>
               <w:fldChar w:fldCharType="begin"/>
-            </w:r>
-            <w:r>
-              <w:rPr>
-                <w:noProof/>
-              </w:rPr>
               <w:instrText xml:space="preserve"> PAGEREF _Toc239405804 \h </w:instrText>
-            </w:r>
-            <w:r>
-              <w:rPr>
-                <w:noProof/>
-              </w:rPr>
-            </w:r>
-            <w:r>
-              <w:rPr>
-                <w:noProof/>
-              </w:rPr>
               <w:fldChar w:fldCharType="separate"/>
-            </w:r>
-            <w:r>
-              <w:rPr>
-                <w:noProof/>
-              </w:rPr>
               <w:t>27</w:t>
-            </w:r>
-            <w:r>
-              <w:rPr>
-                <w:noProof/>
-              </w:rPr>
               <w:fldChar w:fldCharType="end"/>
             </w:r>
           </w:hyperlink>
@@ -2413,40 +1319,10 @@
                 <w:noProof/>
               </w:rPr>
               <w:tab/>
-            </w:r>
-            <w:r>
-              <w:rPr>
-                <w:noProof/>
-              </w:rPr>
               <w:fldChar w:fldCharType="begin"/>
-            </w:r>
-            <w:r>
-              <w:rPr>
-                <w:noProof/>
-              </w:rPr>
               <w:instrText xml:space="preserve"> PAGEREF _Toc239405805 \h </w:instrText>
-            </w:r>
-            <w:r>
-              <w:rPr>
-                <w:noProof/>
-              </w:rPr>
-            </w:r>
-            <w:r>
-              <w:rPr>
-                <w:noProof/>
-              </w:rPr>
               <w:fldChar w:fldCharType="separate"/>
-            </w:r>
-            <w:r>
-              <w:rPr>
-                <w:noProof/>
-              </w:rPr>
               <w:t>28</w:t>
-            </w:r>
-            <w:r>
-              <w:rPr>
-                <w:noProof/>
-              </w:rPr>
               <w:fldChar w:fldCharType="end"/>
             </w:r>
           </w:hyperlink>
@@ -2474,40 +1350,10 @@
                 <w:noProof/>
               </w:rPr>
               <w:tab/>
-            </w:r>
-            <w:r>
-              <w:rPr>
-                <w:noProof/>
-              </w:rPr>
               <w:fldChar w:fldCharType="begin"/>
-            </w:r>
-            <w:r>
-              <w:rPr>
-                <w:noProof/>
-              </w:rPr>
               <w:instrText xml:space="preserve"> PAGEREF _Toc239405806 \h </w:instrText>
-            </w:r>
-            <w:r>
-              <w:rPr>
-                <w:noProof/>
-              </w:rPr>
-            </w:r>
-            <w:r>
-              <w:rPr>
-                <w:noProof/>
-              </w:rPr>
               <w:fldChar w:fldCharType="separate"/>
-            </w:r>
-            <w:r>
-              <w:rPr>
-                <w:noProof/>
-              </w:rPr>
               <w:t>29</w:t>
-            </w:r>
-            <w:r>
-              <w:rPr>
-                <w:noProof/>
-              </w:rPr>
               <w:fldChar w:fldCharType="end"/>
             </w:r>
           </w:hyperlink>
@@ -4002,13 +2848,8 @@
       </w:r>
       <w:r>
         <w:t xml:space="preserve">Los modelos se compararon con cinco métricas: Accuracy, Precision, Recall, F1-Score y AUC-ROC, calculadas sobre el conjunto de validación durante la selección. Se dio prioridad a Recall y F1 de la clase “con falla”, porque en mantenimiento predictivo el error más costoso es no detectar una falla real. </w:t>
-      </w:r>
-      <w:r>
         <w:lastRenderedPageBreak/>
-        <w:t>Una vez congelado el modelo, se realizó una evaluación final independiente sobre el conjunto de prueba, complementada con matriz de confusión y curva ROC</w:t>
-      </w:r>
-      <w:r>
-        <w:t>.</w:t>
+        <w:t>Una vez congelado el modelo, se realizó una evaluación final independiente sobre el conjunto de prueba, complementada con matriz de confusión y curva ROC.</w:t>
       </w:r>
     </w:p>
     <w:p>
@@ -8446,13 +7287,7 @@
         <w:jc w:val="both"/>
       </w:pPr>
       <w:r>
-        <w:t xml:space="preserve">La temperatura del aire y la del proceso suben y bajan casi juntas (correlación de 0,88). La velocidad de rotación y el torque hacen lo contrario: cuando una sube, la otra baja (−0,88). Con la variable objetivo, en cambio, las correlaciones son bajas (torque 0,19; desgaste 0,11; temperatura del aire 0,08), lo que confirma que una falla no depende de una sola variable, sino de la combinación de varias. </w:t>
-      </w:r>
-      <w:r>
-        <w:t>Las variables TWF, HDF, PWF, OSF y RNF se revisaron únicamente durante el análisis exploratorio para identificar posibles relaciones y justificar su exclusión del modelado. Estas variables quedaron fuera del conjunto de predictores utilizado por el sistema, debido a que describen el tipo de falla una vez ocurrida y producirían fuga de información</w:t>
-      </w:r>
-      <w:r>
-        <w:t>.</w:t>
+        <w:t xml:space="preserve">La temperatura del aire y la del proceso suben y bajan casi juntas (correlación de 0,88). La velocidad de rotación y el torque hacen lo contrario: cuando una sube, la otra baja (−0,88). Con la variable objetivo, en cambio, las correlaciones son bajas (torque 0,19; desgaste 0,11; temperatura del aire 0,08), lo que confirma que una falla no depende de una sola variable, sino de la combinación de varias. Las variables TWF, HDF, PWF, OSF y RNF se revisaron únicamente durante el análisis exploratorio para identificar posibles relaciones y justificar su exclusión del modelado. Estas variables quedaron fuera del conjunto de predictores utilizado por el sistema, debido a que describen el tipo de falla una vez ocurrida y producirían fuga de información.</w:t>
       </w:r>
     </w:p>
     <w:p>
@@ -8537,13 +7372,7 @@
         <w:jc w:val="both"/>
       </w:pPr>
       <w:r>
-        <w:t xml:space="preserve">Hay muy pocas fallas en los datos: de 10.000 registros, 9.661 (96,61 %) son “sin falla” y apenas 339 (3,39 %) son “con falla”. Con este desbalance, un modelo podría predecir siempre “sin falla”, acertar el 96,6 % de las veces y aun así no servir de nada, porque nunca aprendería a reconocer una falla. Por eso, </w:t>
-      </w:r>
-      <w:r>
-        <w:t>más adelante se comparan tres técnicas de balanceo, utilizando además un escenario sin balanceo como baseline</w:t>
-      </w:r>
-      <w:r>
-        <w:t xml:space="preserve"> (sección 3.6) y la evaluación se fija sobre todo en el Recall y el F1 de la clase minoritaria.</w:t>
+        <w:t xml:space="preserve">Hay muy pocas fallas en los datos: de 10.000 registros, 9.661 (96,61 %) son “sin falla” y apenas 339 (3,39 %) son “con falla”. Con este desbalance, un modelo podría predecir siempre “sin falla”, acertar el 96,6 % de las veces y aun así no servir de nada, porque nunca aprendería a reconocer una falla. Por eso, más adelante se comparan tres técnicas de balanceo, utilizando además un escenario sin balanceo como baseline (sección 3.6) y la evaluación se fija sobre todo en el Recall y el F1 de la clase minoritaria.</w:t>
       </w:r>
     </w:p>
     <w:p>
@@ -8793,10 +7622,7 @@
         <w:jc w:val="both"/>
       </w:pPr>
       <w:r>
-        <w:t>Las seis alternativas se entrenaron utilizando el conjunto de entrenamiento previamente balanceado con SMOTE y se compararon sobre el mismo conjunto de validación, sin utilizar el conjunto de prueba. La Tabla 6 resume los resultados de esta comparación</w:t>
-      </w:r>
-      <w:r>
-        <w:t>.</w:t>
+        <w:t>Las seis alternativas se entrenaron utilizando el conjunto de entrenamiento previamente balanceado con SMOTE (Chawla et al., 2002) y se compararon sobre el mismo conjunto de validación, sin utilizar el conjunto de prueba. La Tabla 6 resume los resultados de esta comparación.</w:t>
       </w:r>
     </w:p>
     <w:tbl>
@@ -10141,27 +8967,7 @@
           <w:sz w:val="18"/>
           <w:szCs w:val="18"/>
         </w:rPr>
-        <w:t xml:space="preserve">Tabla 6. </w:t>
-      </w:r>
-      <w:r>
-        <w:rPr>
-          <w:i/>
-          <w:iCs/>
-          <w:color w:val="555555"/>
-          <w:sz w:val="18"/>
-          <w:szCs w:val="18"/>
-        </w:rPr>
-        <w:t>Comparación de las 3 técnicas de ML y las 3 arquitecturas de DL sobre el conjunto de validación</w:t>
-      </w:r>
-      <w:r>
-        <w:rPr>
-          <w:i/>
-          <w:iCs/>
-          <w:color w:val="555555"/>
-          <w:sz w:val="18"/>
-          <w:szCs w:val="18"/>
-        </w:rPr>
-        <w:t>.</w:t>
+        <w:t xml:space="preserve">Tabla 6. Comparación de las 3 técnicas de ML y las 3 arquitecturas de DL sobre el conjunto de validación.</w:t>
       </w:r>
     </w:p>
     <w:p>
@@ -10179,7 +8985,7 @@
         <w:jc w:val="both"/>
       </w:pPr>
       <w:r>
-        <w:t>Restricciones computacionales. Todo se entrenó en computadores personales, sin GPU. Los modelos de ML tardaron segundos y las MLP se entrenaron en tiempos acotados; la búsqueda de hiperparámetros evaluó 108 combinaciones × 5 particiones. No se probaron arquitecturas más pesadas como CNN 1D o LSTM: el problema es tabular y el dataset no entrega secuencias temporales. Las máquinas de vectores de soporte quedaron fuera de esta comparación y se mantienen como posible trabajo futuro.</w:t>
+        <w:t>Restricciones computacionales. Todo se entrenó en computadores personales, sin GPU. Los modelos de ML tardaron segundos y las MLP se entrenaron en tiempos acotados; la búsqueda de hiperparámetros evaluó 108 combinaciones × 5 particiones. No se probaron arquitecturas más pesadas como CNN 1D o LSTM: el problema es tabular y el dataset no entrega secuencias temporales. Las máquinas de vectores de soporte (Cortes &amp; Vapnik, 1995) quedaron fuera de esta comparación y se mantienen como posible trabajo futuro.</w:t>
       </w:r>
     </w:p>
     <w:p>
@@ -11698,10 +10504,7 @@
         <w:jc w:val="both"/>
       </w:pPr>
       <w:r>
-        <w:t>El modelo elegido para continuar hacia producción es XGBoost, utilizando Random Oversampling y la configuración obtenida mediante GridSearchCV. Esta alternativa presentó el mejor equilibrio entre F1 y AUC-ROC en la comparación sobre validación y, además, permite aplicar SHAP mediante TreeExplainer, cumpliendo el requisito de explicabilidad</w:t>
-      </w:r>
-      <w:r>
-        <w:t>.</w:t>
+        <w:t>El modelo elegido para continuar hacia producción es XGBoost, utilizando Random Oversampling y la configuración obtenida mediante GridSearchCV. Esta alternativa presentó el mejor equilibrio entre F1 y AUC-ROC en la comparación sobre validación y, además, permite aplicar SHAP mediante TreeExplainer, cumpliendo el requisito de explicabilidad.</w:t>
       </w:r>
     </w:p>
     <w:p>
@@ -12109,15 +10912,7 @@
                 <w:sz w:val="18"/>
                 <w:szCs w:val="18"/>
               </w:rPr>
-              <w:t>0,9</w:t>
-            </w:r>
-            <w:r>
-              <w:rPr>
-                <w:color w:val="000000"/>
-                <w:sz w:val="18"/>
-                <w:szCs w:val="18"/>
-              </w:rPr>
-              <w:t>701</w:t>
+              <w:t>0,9701</w:t>
             </w:r>
           </w:p>
         </w:tc>
@@ -12284,15 +11079,7 @@
                 <w:sz w:val="18"/>
                 <w:szCs w:val="18"/>
               </w:rPr>
-              <w:t>0,949</w:t>
-            </w:r>
-            <w:r>
-              <w:rPr>
-                <w:color w:val="000000"/>
-                <w:sz w:val="18"/>
-                <w:szCs w:val="18"/>
-              </w:rPr>
-              <w:t>9</w:t>
+              <w:t>0,9499</w:t>
             </w:r>
           </w:p>
         </w:tc>
@@ -12459,15 +11246,7 @@
                 <w:sz w:val="18"/>
                 <w:szCs w:val="18"/>
               </w:rPr>
-              <w:t>0,97</w:t>
-            </w:r>
-            <w:r>
-              <w:rPr>
-                <w:color w:val="000000"/>
-                <w:sz w:val="18"/>
-                <w:szCs w:val="18"/>
-              </w:rPr>
-              <w:t>54</w:t>
+              <w:t>0,9754</w:t>
             </w:r>
           </w:p>
         </w:tc>
@@ -12495,10 +11274,7 @@
         <w:jc w:val="both"/>
       </w:pPr>
       <w:r>
-        <w:t>Las tres redes usan la misma activación (ReLU) y el mismo optimizador (Adam); lo único que cambia es la profundidad y el ancho. La Figura 6 muestra la curva de pérdida (log-loss) de entrenamiento. La red profunda (B) baja la pérdida más rápido y converge en la iteración 170, con la pérdida de entrenamiento más baja de las tres (0,0278). Sin embargo, su AUC-ROC en validación es el menor de las tres redes (0,9499). La red superficial (A) no alcanza a converger en 500 iteraciones y obtiene un AUC-ROC de 0,9701, mientras que la red ancha (C) converge en 467 iteraciones y alcanza el mejor AUC-ROC entre las tres, con 0,9754. Esto muestra que una mayor profundidad no garantiza un mejor desempeño para este problema tabular</w:t>
-      </w:r>
-      <w:r>
-        <w:t>.</w:t>
+        <w:t>Las tres redes usan la misma activación (ReLU) y el mismo optimizador (Adam); lo único que cambia es la profundidad y el ancho. La Figura 6 muestra la curva de pérdida (log-loss) de entrenamiento. La red profunda (B) baja la pérdida más rápido y converge en la iteración 170, con la pérdida de entrenamiento más baja de las tres (0,0278). Sin embargo, su AUC-ROC en validación es el menor de las tres redes (0,9499). La red superficial (A) no alcanza a converger en 500 iteraciones y obtiene un AUC-ROC de 0,9701, mientras que la red ancha (C) converge en 467 iteraciones y alcanza el mejor AUC-ROC entre las tres, con 0,9754. Esto muestra que una mayor profundidad no garantiza un mejor desempeño para este problema tabular.</w:t>
       </w:r>
     </w:p>
     <w:p>
@@ -12583,13 +11359,7 @@
         <w:jc w:val="both"/>
       </w:pPr>
       <w:r>
-        <w:t xml:space="preserve">Después de seleccionar XGBoost como candidato, se realizó un ajuste mediante GridSearchCV con 108 combinaciones de n_estimators, max_depth, learning_rate, subsample y colsample_bytree, utilizando validación cruzada estratificada de 5 particiones y optimizando el F1-Score. La mejor configuración fue n_estimators = 300, max_depth = 7, learning_rate = 0,1, subsample = 0,8 y colsample_bytree = 1,0, con un F1 promedio de 0,7323 durante la validación cruzada. </w:t>
-      </w:r>
-      <w:r>
-        <w:t>El refinamiento se realizó sobre la alternativa seleccionada, XGBoost, ajustando sus principales hiperparámetros y manteniendo fija la estructura de entrada y salida definida previamente. De esta manera, el refinamiento posterior permitió mejorar la configuración del modelo seleccionado sin modificar el problema ni incorporar información del conjunto de prueba.</w:t>
-      </w:r>
-      <w:r>
-        <w:t>.</w:t>
+        <w:t xml:space="preserve">Después de seleccionar XGBoost como candidato, se realizó un ajuste mediante GridSearchCV con 108 combinaciones de n_estimators, max_depth, learning_rate, subsample y colsample_bytree, utilizando validación cruzada estratificada de 5 particiones y optimizando el F1-Score. La mejor configuración fue n_estimators = 300, max_depth = 7, learning_rate = 0,1, subsample = 0,8 y colsample_bytree = 1,0, con un F1 promedio de 0,7323 durante la validación cruzada. El refinamiento se realizó sobre la alternativa seleccionada, XGBoost, ajustando sus principales hiperparámetros y manteniendo fija la estructura de entrada y salida definida previamente. De esta manera, el refinamiento posterior permitió mejorar la configuración del modelo seleccionado sin modificar el problema ni incorporar información del conjunto de prueba.</w:t>
       </w:r>
     </w:p>
     <w:tbl>
@@ -13259,27 +12029,7 @@
           <w:sz w:val="18"/>
           <w:szCs w:val="18"/>
         </w:rPr>
-        <w:t xml:space="preserve">Tabla 10. </w:t>
-      </w:r>
-      <w:r>
-        <w:rPr>
-          <w:i/>
-          <w:iCs/>
-          <w:color w:val="555555"/>
-          <w:sz w:val="18"/>
-          <w:szCs w:val="18"/>
-        </w:rPr>
-        <w:t>XGBoost base vs. optimizado con GridSearchCV sobre el conjunto de validación</w:t>
-      </w:r>
-      <w:r>
-        <w:rPr>
-          <w:i/>
-          <w:iCs/>
-          <w:color w:val="555555"/>
-          <w:sz w:val="18"/>
-          <w:szCs w:val="18"/>
-        </w:rPr>
-        <w:t>).</w:t>
+        <w:t xml:space="preserve">Tabla 10. XGBoost base vs. optimizado con GridSearchCV sobre el conjunto de validación).</w:t>
       </w:r>
     </w:p>
     <w:p>
@@ -14455,27 +13205,7 @@
           <w:sz w:val="18"/>
           <w:szCs w:val="18"/>
         </w:rPr>
-        <w:t>Tabla 11. Ef</w:t>
-      </w:r>
-      <w:r>
-        <w:rPr>
-          <w:i/>
-          <w:iCs/>
-          <w:color w:val="555555"/>
-          <w:sz w:val="18"/>
-          <w:szCs w:val="18"/>
-        </w:rPr>
-        <w:t>Comparación de tres técnicas de balanceo y un escenario baseline sobre XGBoost</w:t>
-      </w:r>
-      <w:r>
-        <w:rPr>
-          <w:i/>
-          <w:iCs/>
-          <w:color w:val="555555"/>
-          <w:sz w:val="18"/>
-          <w:szCs w:val="18"/>
-        </w:rPr>
-        <w:t>.</w:t>
+        <w:t>Tabla 11. Comparación de tres técnicas de balanceo y un escenario baseline sobre XGBoost.</w:t>
       </w:r>
     </w:p>
     <w:p>
@@ -14484,10 +13214,7 @@
         <w:jc w:val="both"/>
       </w:pPr>
       <w:r>
-        <w:t>Sin balanceo, el modelo obtiene una Precision de 0,7727 y Accuracy de 0,9820, pero su Recall baja a 0,6667. El submuestreo alcanza el mayor Recall (0,9608), pero reduce fuertemente la Precision a 0,2649 y el F1 a 0,4153, debido a la pérdida de registros de la clase mayoritaria. El sobremuestreo aleatorio presenta el mejor equilibrio, con F1 de 0,7400 y AUC-ROC de 0,9835, además de Precision de 0,7551 y Recall de 0,7255. SMOTE obtiene F1 de 0,6783 y AUC-ROC de 0,9792. Por estos resultados, Random Oversampling fue la estrategia seleccionada para la optimización posterior de XGBoost</w:t>
-      </w:r>
-      <w:r>
-        <w:t>.</w:t>
+        <w:t>Sin balanceo, el modelo obtiene una Precision de 0,7727 y Accuracy de 0,9820, pero su Recall baja a 0,6667. El submuestreo alcanza el mayor Recall (0,9608), pero reduce fuertemente la Precision a 0,2649 y el F1 a 0,4153, debido a la pérdida de registros de la clase mayoritaria. El sobremuestreo aleatorio presenta el mejor equilibrio, con F1 de 0,7400 y AUC-ROC de 0,9835, además de Precision de 0,7551 y Recall de 0,7255. SMOTE obtiene F1 de 0,6783 y AUC-ROC de 0,9792. Por estos resultados, Random Oversampling fue la estrategia seleccionada para la optimización posterior de XGBoost.</w:t>
       </w:r>
     </w:p>
     <w:p>
@@ -14834,10 +13561,7 @@
         <w:jc w:val="both"/>
       </w:pPr>
       <w:r>
-        <w:t>El modelo final, XGBoost optimizado con Random Oversampling, se evaluó una única vez sobre los 1.500 registros del conjunto de prueba, que permaneció reservado durante el proceso de selección. La Tabla 12 resume las métricas obtenidas</w:t>
-      </w:r>
-      <w:r>
-        <w:t>.</w:t>
+        <w:t>El modelo final, XGBoost optimizado con Random Oversampling, se evaluó una única vez sobre los 1.500 registros del conjunto de prueba, que permaneció reservado durante el proceso de selección. La Tabla 12 resume las métricas obtenidas.</w:t>
       </w:r>
     </w:p>
     <w:tbl>
@@ -15206,27 +13930,7 @@
           <w:sz w:val="18"/>
           <w:szCs w:val="18"/>
         </w:rPr>
-        <w:t xml:space="preserve">Tabla 12. </w:t>
-      </w:r>
-      <w:r>
-        <w:rPr>
-          <w:i/>
-          <w:iCs/>
-          <w:color w:val="555555"/>
-          <w:sz w:val="18"/>
-          <w:szCs w:val="18"/>
-        </w:rPr>
-        <w:t>Métricas finales del modelo XGBoost optimizado con Random Oversampling sobre el conjunto de prueba</w:t>
-      </w:r>
-      <w:r>
-        <w:rPr>
-          <w:i/>
-          <w:iCs/>
-          <w:color w:val="555555"/>
-          <w:sz w:val="18"/>
-          <w:szCs w:val="18"/>
-        </w:rPr>
-        <w:t>.</w:t>
+        <w:t xml:space="preserve">Tabla 12. Métricas finales del modelo XGBoost optimizado con Random Oversampling sobre el conjunto de prueba.</w:t>
       </w:r>
     </w:p>
     <w:p>
@@ -15245,10 +13949,7 @@
         <w:jc w:val="both"/>
       </w:pPr>
       <w:r>
-        <w:t>La matriz de confusión (Figura 10) muestra que el modelo clasificó correctamente 1.438 máquinas sin falla y 38 máquinas con falla. Se produjeron 11 falsos positivos y 13 falsos negativos. Los 13 falsos negativos corresponden a fallas reales que no fueron detectadas y representan el principal error a vigilar en una aplicación de mantenimiento predictivo</w:t>
-      </w:r>
-      <w:r>
-        <w:t>.</w:t>
+        <w:t>La matriz de confusión (Figura 10) muestra que el modelo clasificó correctamente 1.438 máquinas sin falla y 38 máquinas con falla. Se produjeron 11 falsos positivos y 13 falsos negativos. Los 13 falsos negativos corresponden a fallas reales que no fueron detectadas y representan el principal error a vigilar en una aplicación de mantenimiento predictivo.</w:t>
       </w:r>
     </w:p>
     <w:p>
@@ -15337,10 +14038,7 @@
         <w:jc w:val="both"/>
       </w:pPr>
       <w:r>
-        <w:t>Se aplicó SHAP (Lundberg &amp; Lee, 2017) con TreeExplainer sobre el XGBoost optimizado. En el análisis global (Figura 11), las variables con mayor influencia fueron, en orden, Torque_Nm, Tool_wear_min y Rotational_speed_rpm, seguidas por Air_temperature_K y Process_temperature_K. Type_L y Type_M presentaron una influencia menor. Esto permite interpretar las predicciones y aportar trazabilidad al resultado del modelo</w:t>
-      </w:r>
-      <w:r>
-        <w:t>.</w:t>
+        <w:t>Se aplicó SHAP (Lundberg &amp; Lee, 2017) con TreeExplainer sobre el XGBoost optimizado. En el análisis global (Figura 11), las variables con mayor influencia fueron, en orden, Torque_Nm, Tool_wear_min y Rotational_speed_rpm, seguidas por Air_temperature_K y Process_temperature_K. Type_L y Type_M presentaron una influencia menor. Esto permite interpretar las predicciones y aportar trazabilidad al resultado del modelo.</w:t>
       </w:r>
     </w:p>
     <w:p>
@@ -15420,10 +14118,7 @@
         <w:jc w:val="both"/>
       </w:pPr>
       <w:r>
-        <w:t>Ver qué variables influyen y en qué dirección es parte de hacer el modelo interpretable (Molnar, 2022). El análisis de casos particulares complementa la visión global</w:t>
-      </w:r>
-      <w:r>
-        <w:t>:</w:t>
+        <w:t>Ver qué variables influyen y en qué dirección es parte de hacer el modelo interpretable (Molnar, 2022). El análisis de casos particulares complementa la visión global:</w:t>
       </w:r>
     </w:p>
     <w:p>
@@ -15439,10 +14134,7 @@
         <w:t xml:space="preserve">Verdadero positivo (Figura 12). </w:t>
       </w:r>
       <w:r>
-        <w:t>En este caso la máquina presenta una predicción de falla cercana al 100 %. La velocidad de rotación (+5,06) y la temperatura del aire (+4,08) son los principales factores que empujan la predicción hacia la falla, seguidos por la temperatura de proceso (+2,24) y el torque (+0,82). El desgaste de herramienta aporta en sentido contrario (-2,33)</w:t>
-      </w:r>
-      <w:r>
-        <w:t>”.</w:t>
+        <w:t>En este caso la máquina presenta una predicción de falla cercana al 100 %. La velocidad de rotación (+5,06) y la temperatura del aire (+4,08) son los principales factores que empujan la predicción hacia la falla, seguidos por la temperatura de proceso (+2,24) y el torque (+0,82). El desgaste de herramienta aporta en sentido contrario (-2,33).</w:t>
       </w:r>
     </w:p>
     <w:p>
@@ -15528,10 +14220,7 @@
         <w:t xml:space="preserve">Falso negativo (Figura 13). </w:t>
       </w:r>
       <w:r>
-        <w:t>La máquina realmente falló, pero el modelo le asignó una probabilidad de falla cercana a 0,1 %. El torque (-2,52), la velocidad de rotación (-2,15) y el desgaste de herramienta (-1,72) empujan la predicción hacia “no falla”, mientras que las contribuciones positivas de otras variables no fueron suficientes para revertir el resultado. El caso muestra una limitación de trabajar con una lectura puntual</w:t>
-      </w:r>
-      <w:r>
-        <w:t>.</w:t>
+        <w:t>La máquina realmente falló, pero el modelo le asignó una probabilidad de falla cercana a 0,1 %. El torque (-2,52), la velocidad de rotación (-2,15) y el desgaste de herramienta (-1,72) empujan la predicción hacia “no falla”, mientras que las contribuciones positivas de otras variables no fueron suficientes para revertir el resultado. El caso muestra una limitación de trabajar con una lectura puntual.</w:t>
       </w:r>
     </w:p>
     <w:p>
@@ -15618,10 +14307,7 @@
         <w:t xml:space="preserve">Verdadero negativo (Figura 14). </w:t>
       </w:r>
       <w:r>
-        <w:t>La máquina fue clasificada correctamente como “sin falla”. El desgaste de herramienta (-4,36), el torque (-3,68) y la velocidad de rotación (-2,63) son las principales contribuciones hacia una predicción de bajo riesgo</w:t>
-      </w:r>
-      <w:r>
-        <w:t>.</w:t>
+        <w:t>La máquina fue clasificada correctamente como “sin falla”. El desgaste de herramienta (-4,36), el torque (-3,68) y la velocidad de rotación (-2,63) son las principales contribuciones hacia una predicción de bajo riesgo.</w:t>
       </w:r>
     </w:p>
     <w:p>
@@ -15737,8 +14423,6 @@
       </w:pPr>
       <w:r>
         <w:t xml:space="preserve">Este objetivo se cumplió mediante el análisis exploratorio del dataset AI4I 2020. Se revisaron las variables, su completitud, consistencia y rangos, además de las estadísticas descriptivas, valores atípicos, correlaciones y distribución de las clases. Se identificó un fuerte desbalance, con solo un 3,39 % de </w:t>
-      </w:r>
-      <w:r>
         <w:lastRenderedPageBreak/>
         <w:t>registros asociados a fallas, lo que justificó incorporar estrategias específicas de balanceo antes del entrenamiento.</w:t>
       </w:r>
@@ -16083,7 +14767,7 @@
         <w:jc w:val="both"/>
       </w:pPr>
       <w:r>
-        <w:t>Dataset simulado: AI4I 2020 es un conjunto generado, no datos reales de una planta. Antes de usar el sistema en producción habría que revalidar todo con mediciones reales..</w:t>
+        <w:t>Dataset simulado: AI4I 2020 es un conjunto generado, no datos reales de una planta. Antes de usar el sistema en producción habría que revalidar todo con mediciones reales.</w:t>
       </w:r>
     </w:p>
     <w:p>

</xml_diff>